<commit_message>
docs: revise topolink cci short communication
</commit_message>
<xml_diff>
--- a/benchmarking/cci_2026_atera/topolink_cci_short_communication/nature_short_communication_20260516/manuscript/topolink_cci_short_communication_review_copy.docx
+++ b/benchmarking/cci_2026_atera/topolink_cci_short_communication/nature_short_communication_20260516/manuscript/topolink_cci_short_communication_review_copy.docx
@@ -51,7 +51,7 @@
         <w:spacing w:after="80" w:line="252" w:lineRule="auto"/>
       </w:pPr>
       <w:r>
-        <w:t>Spatial cell-cell interaction inference is confounded by co-expression, cell abundance and incomplete molecular resources. We introduce TopoLink-CCI, a topology-guided framework that integrates tissue topology, expression specificity and local contact, then challenges candidates with orthogonal controls. In Xenium WTA breast and cervical cancers, TopoLink-CCI scales to whole datasets and prioritizes interpretable vascular, stromal, immune and tumor interaction axes.</w:t>
+        <w:t>Spatial cell-cell interaction inference is confounded by co-expression, cell abundance and incomplete molecular resources. We introduce TopoLink-CCI, a topology-guided framework that integrates tissue topology, expression specificity and local contact, then challenges candidates with orthogonal controls. In Xenium WTA breast cancer, an expanded 18-method benchmark reached nine full and nine bounded terminal results with no failure or deferred methods; cervical WTA analysis showed tissue-context-specific tumor adhesion axes.</w:t>
       </w:r>
     </w:p>
     <w:p>
@@ -83,7 +83,7 @@
         <w:spacing w:after="80" w:line="252" w:lineRule="auto"/>
       </w:pPr>
       <w:r>
-        <w:t>We first evaluated the scoring logic in a topology-preserving Synthetic Truth benchmark. The full TopoLink-CCI model achieved AUROC 0.9919 and AUPRC 0.8333, whereas the topology-anchor-only model retained high AUROC (0.9839) but dropped to AUPRC 0.5833. We then applied TopoLink-CCI to Atera Xenium WTA breast cancer, generating 1,319,600 common-resource CCI hypotheses from 170,057 cells. The expanded breast benchmark includes 18 terminalized methods: nine full results, six bounded subset results and three reproducible failure cards, with no deferred methods. Seven representative axes were evaluated with orthogonal controls inspired by established CCI methods, including cell-label permutation, spatial nulls, matched-expression gene controls, downstream target support, received-signal association, cross-method consensus, component ablation and bootstrap stability.</w:t>
+        <w:t>We first evaluated the scoring logic in a topology-preserving Synthetic Truth benchmark. The full TopoLink-CCI model achieved AUROC 0.9919 and AUPRC 0.8333, whereas the topology-anchor-only model retained high AUROC (0.9839) but dropped to AUPRC 0.5833. We then applied TopoLink-CCI to Atera Xenium WTA breast cancer, generating 1,319,600 common-resource CCI hypotheses from 170,057 cells. The expanded breast benchmark now includes 18 terminalized methods: nine full whole-dataset results and nine bounded subset results, with zero failure cards and zero deferred methods. Late-stage rescue runs converted FastCCC, SCILD, Copulacci and NicheNet into bounded appendix evidence, with NicheNet interpreted specifically as downstream receiver-response support rather than a direct spatial CCI ranker. Seven representative axes were evaluated with orthogonal controls inspired by established CCI methods, including cell-label permutation, spatial nulls, matched-expression gene controls, downstream target support, received-signal association, cross-method consensus, component ablation and bootstrap stability.</w:t>
       </w:r>
     </w:p>
     <w:p>
@@ -115,7 +115,7 @@
         <w:spacing w:after="80" w:line="252" w:lineRule="auto"/>
       </w:pPr>
       <w:r>
-        <w:t>Figure 2 | Whole-dataset discovery and biological interpretation. a, Top interpretable Breast WTA axes ranked by TopoLink-CCI score. b, VWF-SELP component decomposition shows joint topology, expression and local-contact support. c, VWF-SELP endothelial hotspots are shown as RNA-level spatial evidence. d, The expanded breast benchmark terminalizes 18 methods into full, bounded and reproducible-failure tiers. e, Canonical recovery is compared by within-method rank rather than raw score. f, Breast and cervical WTA datasets yield tissue-context-specific top axes.</w:t>
+        <w:t>Figure 2 | Whole-dataset benchmarking and biological interpretation. a, The expanded Breast WTA benchmark terminalizes 18 methods as nine full whole-dataset results and nine bounded subset results, with zero failure cards and zero deferred methods. b, Top interpretable Breast WTA axes ranked by TopoLink-CCI score are led by VWF-SELP. c, Canonical recovery is compared by within-method rank rather than raw score. d, Breast and cervical WTA datasets yield tissue-context-specific top axes, including DSC2-DSG3 in cervical differentiating tumor cells. e, Bounded appendix methods provide scalability-aware terminal evidence, including FastCCC, SCILD, Copulacci and NicheNet late-stage rescue results.</w:t>
       </w:r>
     </w:p>
     <w:p>
@@ -211,7 +211,7 @@
       <w:r>
         <w:drawing>
           <wp:inline xmlns:a="http://schemas.openxmlformats.org/drawingml/2006/main" xmlns:pic="http://schemas.openxmlformats.org/drawingml/2006/picture">
-            <wp:extent cx="6309360" cy="7336569"/>
+            <wp:extent cx="6309360" cy="7072346"/>
             <wp:docPr id="2" name="Picture 2"/>
             <wp:cNvGraphicFramePr>
               <a:graphicFrameLocks noChangeAspect="1"/>
@@ -232,7 +232,7 @@
                   <pic:spPr>
                     <a:xfrm>
                       <a:off x="0" y="0"/>
-                      <a:ext cx="6309360" cy="7336569"/>
+                      <a:ext cx="6309360" cy="7072346"/>
                     </a:xfrm>
                     <a:prstGeom prst="rect"/>
                   </pic:spPr>

</xml_diff>

<commit_message>
docs: format topolink cci nature submission package
</commit_message>
<xml_diff>
--- a/benchmarking/cci_2026_atera/topolink_cci_short_communication/nature_short_communication_20260516/manuscript/topolink_cci_short_communication_review_copy.docx
+++ b/benchmarking/cci_2026_atera/topolink_cci_short_communication/nature_short_communication_20260516/manuscript/topolink_cci_short_communication_review_copy.docx
@@ -51,7 +51,7 @@
         <w:spacing w:after="80" w:line="252" w:lineRule="auto"/>
       </w:pPr>
       <w:r>
-        <w:t>Spatial cell-cell interaction inference is confounded by co-expression, cell abundance and incomplete molecular resources. We introduce TopoLink-CCI, a topology-guided framework that integrates tissue topology, expression specificity and local contact, then challenges candidates with orthogonal controls. In Xenium WTA breast cancer, an expanded 18-method benchmark reached nine full and nine bounded terminal results with no failure or deferred methods; cervical WTA analysis showed tissue-context-specific tumor adhesion axes.</w:t>
+        <w:t>Spatial cell-cell interaction inference is confounded by co-expression, cell abundance and incomplete molecular resources. We introduce TopoLink-CCI, a topology-guided framework that integrates tissue topology, expression specificity and local contact, then challenges candidates with orthogonal controls. In public 10x Genomics Atera Whole Transcriptome Assay (Atera WTA) FFPE breast cancer data, an expanded 18-method benchmark reached nine full and nine bounded terminal results with no failure or deferred methods; Atera WTA cervical cancer analysis showed tissue-context-specific tumor adhesion axes.</w:t>
       </w:r>
     </w:p>
     <w:p>
@@ -83,7 +83,7 @@
         <w:spacing w:after="80" w:line="252" w:lineRule="auto"/>
       </w:pPr>
       <w:r>
-        <w:t>We first evaluated the scoring logic in a topology-preserving Synthetic Truth benchmark. The full TopoLink-CCI model achieved AUROC 0.9919 and AUPRC 0.8333, whereas the topology-anchor-only model retained high AUROC (0.9839) but dropped to AUPRC 0.5833. We then applied TopoLink-CCI to Atera Xenium WTA breast cancer, generating 1,319,600 common-resource CCI hypotheses from 170,057 cells. The expanded breast benchmark now includes 18 terminalized methods: nine full whole-dataset results and nine bounded subset results, with zero failure cards and zero deferred methods. Late-stage rescue runs converted FastCCC, SCILD, Copulacci and NicheNet into bounded appendix evidence, with NicheNet interpreted specifically as downstream receiver-response support rather than a direct spatial CCI ranker. Seven representative axes were evaluated with orthogonal controls inspired by established CCI methods, including cell-label permutation, spatial nulls, matched-expression gene controls, downstream target support, received-signal association, cross-method consensus, component ablation and bootstrap stability.</w:t>
+        <w:t>We first evaluated the scoring logic in a topology-preserving Synthetic Truth benchmark. The full TopoLink-CCI model achieved AUROC 0.9919 and AUPRC 0.8333, whereas the topology-anchor-only model retained high AUROC (0.9839) but dropped to AUPRC 0.5833. We then applied TopoLink-CCI to the public 10x Genomics Preview Data: Atera In Situ Gene Expression, FFPE Human Breast Cancer dataset, generated using the pre-commercial Atera Whole Transcriptome Assay (Atera WTA) and Atera Onboard Analysis development workflow. TopoLink-CCI generated 1,319,600 common-resource CCI hypotheses from 170,057 cells in this breast cancer tissue. The expanded breast benchmark now includes 18 terminalized methods: nine full whole-dataset results and nine bounded subset results, with zero failure cards and zero deferred methods. Late-stage rescue runs converted FastCCC, SCILD, Copulacci and NicheNet into bounded appendix evidence, with NicheNet interpreted specifically as downstream receiver-response support rather than a direct spatial CCI ranker. Seven representative axes were evaluated with orthogonal controls inspired by established CCI methods, including cell-label permutation, spatial nulls, matched-expression gene controls, downstream target support, received-signal association, cross-method consensus, component ablation and bootstrap stability.</w:t>
       </w:r>
     </w:p>
     <w:p>
@@ -91,7 +91,7 @@
         <w:spacing w:after="80" w:line="252" w:lineRule="auto"/>
       </w:pPr>
       <w:r>
-        <w:t>TopoLink-CCI prioritized biologically interpretable axes spanning vascular activation, stromal matrix biology, immune adhesion, Notch signaling and tumor-intrinsic adhesion. The top breast axis, VWF-SELP from endothelial cells to endothelial cells, is best interpreted as an endothelial activation and vascular adhesion niche consistent with Weibel-Palade body biology, not as direct proof of VWF/P-selectin protein release. Cross-dataset application to Xenium WTA cervical cancer produced 2,404,971 hypotheses and a distinct top tumor-adhesion axis, DSC2-DSG3 in differentiating tumor cells, supporting tissue-context-specific prioritization. TopoLink-CCI is therefore a spatial CCI hypothesis-prioritization framework: it narrows a large molecular search space to axes consistent with tissue topology, expression specificity, local contact and independent computational controls, while leaving causal signaling and protein-level mechanism to orthogonal experimental validation.</w:t>
+        <w:t>TopoLink-CCI prioritized biologically interpretable axes spanning vascular activation, stromal matrix biology, immune adhesion, Notch signaling and tumor-intrinsic adhesion. The top breast axis, VWF-SELP from endothelial cells to endothelial cells, is best interpreted as an endothelial activation and vascular adhesion niche consistent with Weibel-Palade body biology, not as direct proof of VWF/P-selectin protein release. Cross-dataset application to the corresponding public 10x Genomics Preview Data: Atera In Situ Gene Expression, FFPE Human Cervical Cancer dataset produced 2,404,971 hypotheses from 717,576 cells and a distinct top tumor-adhesion axis, DSC2-DSG3 in differentiating tumor cells, supporting tissue-context-specific prioritization. TopoLink-CCI is therefore a spatial CCI hypothesis-prioritization framework: it narrows a large molecular search space to axes consistent with tissue topology, expression specificity, local contact and independent computational controls, while leaving causal signaling and protein-level mechanism to orthogonal experimental validation.</w:t>
       </w:r>
     </w:p>
     <w:p>
@@ -107,7 +107,7 @@
         <w:spacing w:after="80" w:line="252" w:lineRule="auto"/>
       </w:pPr>
       <w:r>
-        <w:t>Figure 1 | TopoLink-CCI method and validation logic. a, Spatial CCI inference is vulnerable to co-expression, cell-abundance, proximity and resource-composition false positives. b, TopoLink-CCI scores each candidate using sender and receiver topology anchors, structure bridging, expression support and local contact. c, Workflow from Xenium WTA and pyXenium topology maps to ranked CCI axes and validation controls. d, Synthetic Truth evaluation shows that the full model achieves AUROC 0.9919 and AUPRC 0.8333, whereas topology-anchor-only scoring loses precision-recall performance. e, Orthogonal evidence matrix for seven interpretable breast cancer axes.</w:t>
+        <w:t>Figure 1 | TopoLink-CCI method and validation logic. a, Spatial CCI inference is vulnerable to co-expression, cell-abundance, proximity and resource-composition false positives. b, TopoLink-CCI scores each candidate using sender and receiver topology anchors, structure bridging, expression support and local contact. c, Workflow from Atera WTA preview datasets and pyXenium topology maps to ranked CCI axes and validation controls. d, Synthetic Truth evaluation shows that the full model achieves AUROC 0.9919 and AUPRC 0.8333, whereas topology-anchor-only scoring loses precision-recall performance. e, Orthogonal evidence matrix for seven interpretable breast cancer axes.</w:t>
       </w:r>
     </w:p>
     <w:p>
@@ -211,7 +211,7 @@
       <w:r>
         <w:drawing>
           <wp:inline xmlns:a="http://schemas.openxmlformats.org/drawingml/2006/main" xmlns:pic="http://schemas.openxmlformats.org/drawingml/2006/picture">
-            <wp:extent cx="6309360" cy="7072346"/>
+            <wp:extent cx="6309360" cy="5657014"/>
             <wp:docPr id="2" name="Picture 2"/>
             <wp:cNvGraphicFramePr>
               <a:graphicFrameLocks noChangeAspect="1"/>
@@ -232,7 +232,7 @@
                   <pic:spPr>
                     <a:xfrm>
                       <a:off x="0" y="0"/>
-                      <a:ext cx="6309360" cy="7072346"/>
+                      <a:ext cx="6309360" cy="5657014"/>
                     </a:xfrm>
                     <a:prstGeom prst="rect"/>
                   </pic:spPr>

</xml_diff>